<commit_message>
Note the CN-Fungi organization in the tester guide
The user edited the guide in Word: the repository now lives under the CN-Fungi
organization, and testers with a GitHub account of their own are invited to ask
to be added. Structure re-checked (valid OPC package, 20 images, 161 paragraphs)
and the repository URL still points at CN-Fungi/Fungi.
</commit_message>
<xml_diff>
--- a/docs/测试人员必看！.docx
+++ b/docs/测试人员必看！.docx
@@ -181,14 +181,27 @@
         </w:rPr>
         <w:t>GitHub地址：</w:t>
       </w:r>
-      <w:hyperlink r:id="rId6" w:history="1">
-        <w:r>
-          <w:rPr>
-            <w:rStyle w:val="ae"/>
-          </w:rPr>
-          <w:t>https://github.com/CN-Fungi/Fungi</w:t>
-        </w:r>
-      </w:hyperlink>
+      <w:r>
+        <w:fldChar w:fldCharType="begin"/>
+      </w:r>
+      <w:r>
+        <w:instrText>HYPERLINK "https://github.com/CN-Fungi/Fungi"</w:instrText>
+      </w:r>
+      <w:r>
+        <w:rPr>
+          <w:rFonts w:hint="eastAsia"/>
+        </w:rPr>
+        <w:fldChar w:fldCharType="separate"/>
+      </w:r>
+      <w:r>
+        <w:rPr>
+          <w:rStyle w:val="ae"/>
+        </w:rPr>
+        <w:t>https://github.com/CN-Fungi/Fungi</w:t>
+      </w:r>
+      <w:r>
+        <w:fldChar w:fldCharType="end"/>
+      </w:r>
     </w:p>
     <w:p>
       <w:pPr>
@@ -254,7 +267,7 @@
                     <pic:cNvPicPr/>
                   </pic:nvPicPr>
                   <pic:blipFill>
-                    <a:blip r:embed="rId7"/>
+                    <a:blip r:embed="rId6"/>
                     <a:stretch>
                       <a:fillRect/>
                     </a:stretch>
@@ -284,88 +297,34 @@
       </w:pPr>
     </w:p>
     <w:p>
-      <w:pPr>
-        <w:pStyle w:val="a9"/>
-        <w:rPr>
-          <w:rFonts w:hint="eastAsia"/>
-        </w:rPr>
-      </w:pPr>
-    </w:p>
-    <w:p>
-      <w:pPr>
-        <w:pStyle w:val="a9"/>
-        <w:rPr>
-          <w:rFonts w:hint="eastAsia"/>
-        </w:rPr>
-      </w:pPr>
-    </w:p>
-    <w:p>
-      <w:pPr>
-        <w:pStyle w:val="a9"/>
-        <w:rPr>
-          <w:rFonts w:hint="eastAsia"/>
-        </w:rPr>
-      </w:pPr>
-    </w:p>
-    <w:p>
-      <w:pPr>
-        <w:pStyle w:val="a9"/>
-        <w:rPr>
-          <w:rFonts w:hint="eastAsia"/>
-        </w:rPr>
-      </w:pPr>
-    </w:p>
-    <w:p>
-      <w:pPr>
-        <w:pStyle w:val="a9"/>
-        <w:rPr>
-          <w:rFonts w:hint="eastAsia"/>
-        </w:rPr>
-      </w:pPr>
-    </w:p>
-    <w:p>
-      <w:pPr>
-        <w:pStyle w:val="a9"/>
-        <w:rPr>
-          <w:rFonts w:hint="eastAsia"/>
-        </w:rPr>
-      </w:pPr>
-    </w:p>
-    <w:p>
-      <w:pPr>
-        <w:pStyle w:val="a9"/>
-        <w:rPr>
-          <w:rFonts w:hint="eastAsia"/>
-        </w:rPr>
-      </w:pPr>
-    </w:p>
-    <w:p>
-      <w:pPr>
-        <w:pStyle w:val="a9"/>
-        <w:rPr>
-          <w:rFonts w:hint="eastAsia"/>
-        </w:rPr>
-      </w:pPr>
-    </w:p>
-    <w:p>
-      <w:pPr>
-        <w:pStyle w:val="a9"/>
-        <w:rPr>
-          <w:rFonts w:hint="eastAsia"/>
-        </w:rPr>
-      </w:pPr>
-    </w:p>
-    <w:p>
-      <w:pPr>
-        <w:pStyle w:val="a9"/>
-        <w:rPr>
-          <w:rFonts w:hint="eastAsia"/>
-        </w:rPr>
-      </w:pPr>
-    </w:p>
-    <w:p>
-      <w:pPr>
-        <w:pStyle w:val="a9"/>
+      <w:r>
+        <w:rPr>
+          <w:rFonts w:hint="eastAsia"/>
+        </w:rPr>
+        <w:t>9月12补充：</w:t>
+      </w:r>
+      <w:r>
+        <w:rPr>
+          <w:rFonts w:hint="eastAsia"/>
+          <w:b/>
+          <w:bCs/>
+        </w:rPr>
+        <w:t>已经将项目仓库迁移到CN-Fungi下，这是我们小组的组织。</w:t>
+      </w:r>
+      <w:r>
+        <w:rPr>
+          <w:rFonts w:hint="eastAsia"/>
+        </w:rPr>
+        <w:t>如果创建了GitHub仓库，可以申请加入，或者告诉我拉进去。</w:t>
+      </w:r>
+    </w:p>
+    <w:p/>
+    <w:p/>
+    <w:p/>
+    <w:p/>
+    <w:p/>
+    <w:p>
+      <w:pPr>
         <w:rPr>
           <w:rFonts w:hint="eastAsia"/>
         </w:rPr>
@@ -417,7 +376,7 @@
                     <pic:cNvPicPr/>
                   </pic:nvPicPr>
                   <pic:blipFill>
-                    <a:blip r:embed="rId8"/>
+                    <a:blip r:embed="rId7"/>
                     <a:stretch>
                       <a:fillRect/>
                     </a:stretch>
@@ -491,7 +450,7 @@
                     <pic:cNvPicPr/>
                   </pic:nvPicPr>
                   <pic:blipFill>
-                    <a:blip r:embed="rId9"/>
+                    <a:blip r:embed="rId8"/>
                     <a:stretch>
                       <a:fillRect/>
                     </a:stretch>
@@ -540,7 +499,7 @@
                     <pic:cNvPicPr/>
                   </pic:nvPicPr>
                   <pic:blipFill>
-                    <a:blip r:embed="rId10"/>
+                    <a:blip r:embed="rId9"/>
                     <a:stretch>
                       <a:fillRect/>
                     </a:stretch>
@@ -625,6 +584,54 @@
                 <pic:pic xmlns:pic="http://schemas.openxmlformats.org/drawingml/2006/picture">
                   <pic:nvPicPr>
                     <pic:cNvPr id="2046942151" name=""/>
+                    <pic:cNvPicPr/>
+                  </pic:nvPicPr>
+                  <pic:blipFill>
+                    <a:blip r:embed="rId10"/>
+                    <a:stretch>
+                      <a:fillRect/>
+                    </a:stretch>
+                  </pic:blipFill>
+                  <pic:spPr>
+                    <a:xfrm>
+                      <a:off x="0" y="0"/>
+                      <a:ext cx="5274310" cy="4937125"/>
+                    </a:xfrm>
+                    <a:prstGeom prst="rect">
+                      <a:avLst/>
+                    </a:prstGeom>
+                  </pic:spPr>
+                </pic:pic>
+              </a:graphicData>
+            </a:graphic>
+          </wp:inline>
+        </w:drawing>
+      </w:r>
+    </w:p>
+    <w:p>
+      <w:pPr>
+        <w:rPr>
+          <w:rFonts w:hint="eastAsia"/>
+        </w:rPr>
+      </w:pPr>
+      <w:r>
+        <w:rPr>
+          <w:noProof/>
+        </w:rPr>
+        <w:lastRenderedPageBreak/>
+        <w:drawing>
+          <wp:inline distT="0" distB="0" distL="0" distR="0" wp14:anchorId="471C43AE" wp14:editId="03826C2A">
+            <wp:extent cx="5274310" cy="4937125"/>
+            <wp:effectExtent l="0" t="0" r="2540" b="0"/>
+            <wp:docPr id="1419067235" name="图片 1"/>
+            <wp:cNvGraphicFramePr>
+              <a:graphicFrameLocks xmlns:a="http://schemas.openxmlformats.org/drawingml/2006/main" noChangeAspect="1"/>
+            </wp:cNvGraphicFramePr>
+            <a:graphic xmlns:a="http://schemas.openxmlformats.org/drawingml/2006/main">
+              <a:graphicData uri="http://schemas.openxmlformats.org/drawingml/2006/picture">
+                <pic:pic xmlns:pic="http://schemas.openxmlformats.org/drawingml/2006/picture">
+                  <pic:nvPicPr>
+                    <pic:cNvPr id="1419067235" name=""/>
                     <pic:cNvPicPr/>
                   </pic:nvPicPr>
                   <pic:blipFill>
@@ -655,54 +662,6 @@
           <w:rFonts w:hint="eastAsia"/>
         </w:rPr>
       </w:pPr>
-      <w:r>
-        <w:rPr>
-          <w:noProof/>
-        </w:rPr>
-        <w:lastRenderedPageBreak/>
-        <w:drawing>
-          <wp:inline distT="0" distB="0" distL="0" distR="0" wp14:anchorId="471C43AE" wp14:editId="03826C2A">
-            <wp:extent cx="5274310" cy="4937125"/>
-            <wp:effectExtent l="0" t="0" r="2540" b="0"/>
-            <wp:docPr id="1419067235" name="图片 1"/>
-            <wp:cNvGraphicFramePr>
-              <a:graphicFrameLocks xmlns:a="http://schemas.openxmlformats.org/drawingml/2006/main" noChangeAspect="1"/>
-            </wp:cNvGraphicFramePr>
-            <a:graphic xmlns:a="http://schemas.openxmlformats.org/drawingml/2006/main">
-              <a:graphicData uri="http://schemas.openxmlformats.org/drawingml/2006/picture">
-                <pic:pic xmlns:pic="http://schemas.openxmlformats.org/drawingml/2006/picture">
-                  <pic:nvPicPr>
-                    <pic:cNvPr id="1419067235" name=""/>
-                    <pic:cNvPicPr/>
-                  </pic:nvPicPr>
-                  <pic:blipFill>
-                    <a:blip r:embed="rId12"/>
-                    <a:stretch>
-                      <a:fillRect/>
-                    </a:stretch>
-                  </pic:blipFill>
-                  <pic:spPr>
-                    <a:xfrm>
-                      <a:off x="0" y="0"/>
-                      <a:ext cx="5274310" cy="4937125"/>
-                    </a:xfrm>
-                    <a:prstGeom prst="rect">
-                      <a:avLst/>
-                    </a:prstGeom>
-                  </pic:spPr>
-                </pic:pic>
-              </a:graphicData>
-            </a:graphic>
-          </wp:inline>
-        </w:drawing>
-      </w:r>
-    </w:p>
-    <w:p>
-      <w:pPr>
-        <w:rPr>
-          <w:rFonts w:hint="eastAsia"/>
-        </w:rPr>
-      </w:pPr>
     </w:p>
     <w:p>
       <w:pPr>
@@ -854,7 +813,7 @@
                     <pic:cNvPicPr/>
                   </pic:nvPicPr>
                   <pic:blipFill>
-                    <a:blip r:embed="rId13"/>
+                    <a:blip r:embed="rId12"/>
                     <a:stretch>
                       <a:fillRect/>
                     </a:stretch>
@@ -902,7 +861,7 @@
                     <pic:cNvPicPr/>
                   </pic:nvPicPr>
                   <pic:blipFill>
-                    <a:blip r:embed="rId14"/>
+                    <a:blip r:embed="rId13"/>
                     <a:stretch>
                       <a:fillRect/>
                     </a:stretch>
@@ -994,7 +953,7 @@
                     <pic:cNvPicPr/>
                   </pic:nvPicPr>
                   <pic:blipFill>
-                    <a:blip r:embed="rId15"/>
+                    <a:blip r:embed="rId14"/>
                     <a:stretch>
                       <a:fillRect/>
                     </a:stretch>
@@ -1070,7 +1029,7 @@
                     </pic:cNvPicPr>
                   </pic:nvPicPr>
                   <pic:blipFill>
-                    <a:blip r:embed="rId16" cstate="print">
+                    <a:blip r:embed="rId15" cstate="print">
                       <a:extLst>
                         <a:ext uri="{28A0092B-C50C-407E-A947-70E740481C1C}">
                           <a14:useLocalDpi xmlns:a14="http://schemas.microsoft.com/office/drawing/2010/main" val="0"/>
@@ -1222,7 +1181,7 @@
                     <pic:cNvPicPr/>
                   </pic:nvPicPr>
                   <pic:blipFill>
-                    <a:blip r:embed="rId17"/>
+                    <a:blip r:embed="rId16"/>
                     <a:stretch>
                       <a:fillRect/>
                     </a:stretch>
@@ -1272,7 +1231,14 @@
         <w:rPr>
           <w:rFonts w:hint="eastAsia"/>
         </w:rPr>
-        <w:t>如果发起后网络环境发生变化</w:t>
+        <w:t>如果发起后网络环境发生</w:t>
+      </w:r>
+      <w:proofErr w:type="gramStart"/>
+      <w:r>
+        <w:rPr>
+          <w:rFonts w:hint="eastAsia"/>
+        </w:rPr>
+        <w:t>变化</w:t>
       </w:r>
       <w:r>
         <w:rPr>
@@ -1280,11 +1246,19 @@
         </w:rPr>
         <w:t>,</w:t>
       </w:r>
-      <w:r>
-        <w:rPr>
-          <w:rFonts w:hint="eastAsia"/>
-        </w:rPr>
-        <w:t>可以刷新IP再试</w:t>
+      <w:proofErr w:type="gramEnd"/>
+      <w:r>
+        <w:rPr>
+          <w:rFonts w:hint="eastAsia"/>
+        </w:rPr>
+        <w:t>可以刷新IP再</w:t>
+      </w:r>
+      <w:proofErr w:type="gramStart"/>
+      <w:r>
+        <w:rPr>
+          <w:rFonts w:hint="eastAsia"/>
+        </w:rPr>
+        <w:t>试</w:t>
       </w:r>
       <w:r>
         <w:rPr>
@@ -1292,6 +1266,7 @@
         </w:rPr>
         <w:t>)</w:t>
       </w:r>
+      <w:proofErr w:type="gramEnd"/>
       <w:r>
         <w:rPr>
           <w:rFonts w:hint="eastAsia"/>
@@ -1325,7 +1300,7 @@
                     <pic:cNvPicPr/>
                   </pic:nvPicPr>
                   <pic:blipFill>
-                    <a:blip r:embed="rId18"/>
+                    <a:blip r:embed="rId17"/>
                     <a:stretch>
                       <a:fillRect/>
                     </a:stretch>
@@ -1357,7 +1332,21 @@
           <w:rFonts w:hint="eastAsia"/>
         </w:rPr>
         <w:lastRenderedPageBreak/>
-        <w:t>发起或加入房间后，点击下方“打开WebUI”即可进入网页：</w:t>
+        <w:t>发起或加入房间后，点击下方“打开</w:t>
+      </w:r>
+      <w:proofErr w:type="spellStart"/>
+      <w:r>
+        <w:rPr>
+          <w:rFonts w:hint="eastAsia"/>
+        </w:rPr>
+        <w:t>WebUI</w:t>
+      </w:r>
+      <w:proofErr w:type="spellEnd"/>
+      <w:r>
+        <w:rPr>
+          <w:rFonts w:hint="eastAsia"/>
+        </w:rPr>
+        <w:t>”即可进入网页：</w:t>
       </w:r>
     </w:p>
     <w:p>
@@ -1371,7 +1360,7 @@
           <w:noProof/>
         </w:rPr>
         <w:drawing>
-          <wp:inline distT="0" distB="0" distL="0" distR="0" wp14:anchorId="049B5030" wp14:editId="7BB3E939">
+          <wp:inline distT="0" distB="0" distL="0" distR="0" wp14:anchorId="049B5030" wp14:editId="00BDA4F3">
             <wp:extent cx="5274310" cy="3378835"/>
             <wp:effectExtent l="0" t="0" r="2540" b="0"/>
             <wp:docPr id="554474087" name="图片 3"/>
@@ -1388,7 +1377,7 @@
                     </pic:cNvPicPr>
                   </pic:nvPicPr>
                   <pic:blipFill>
-                    <a:blip r:embed="rId19" cstate="print">
+                    <a:blip r:embed="rId18" cstate="print">
                       <a:extLst>
                         <a:ext uri="{28A0092B-C50C-407E-A947-70E740481C1C}">
                           <a14:useLocalDpi xmlns:a14="http://schemas.microsoft.com/office/drawing/2010/main" val="0"/>
@@ -1484,7 +1473,7 @@
                     <pic:cNvPicPr/>
                   </pic:nvPicPr>
                   <pic:blipFill>
-                    <a:blip r:embed="rId20"/>
+                    <a:blip r:embed="rId19"/>
                     <a:stretch>
                       <a:fillRect/>
                     </a:stretch>
@@ -1564,14 +1553,27 @@
         </w:rPr>
         <w:t>创建API：</w:t>
       </w:r>
-      <w:hyperlink r:id="rId21" w:history="1">
-        <w:r>
-          <w:rPr>
-            <w:rStyle w:val="ae"/>
-          </w:rPr>
-          <w:t>https://platform.deepseek.com/api_keys</w:t>
-        </w:r>
-      </w:hyperlink>
+      <w:r>
+        <w:fldChar w:fldCharType="begin"/>
+      </w:r>
+      <w:r>
+        <w:instrText>HYPERLINK "https://platform.deepseek.com/api_keys"</w:instrText>
+      </w:r>
+      <w:r>
+        <w:rPr>
+          <w:rFonts w:hint="eastAsia"/>
+        </w:rPr>
+        <w:fldChar w:fldCharType="separate"/>
+      </w:r>
+      <w:r>
+        <w:rPr>
+          <w:rStyle w:val="ae"/>
+        </w:rPr>
+        <w:t>https://platform.deepseek.com/api_keys</w:t>
+      </w:r>
+      <w:r>
+        <w:fldChar w:fldCharType="end"/>
+      </w:r>
     </w:p>
     <w:p>
       <w:pPr>
@@ -1599,7 +1601,7 @@
                     <pic:cNvPicPr/>
                   </pic:nvPicPr>
                   <pic:blipFill>
-                    <a:blip r:embed="rId22"/>
+                    <a:blip r:embed="rId20"/>
                     <a:stretch>
                       <a:fillRect/>
                     </a:stretch>
@@ -1627,6 +1629,9 @@
           <w:ilvl w:val="0"/>
           <w:numId w:val="4"/>
         </w:numPr>
+        <w:rPr>
+          <w:rFonts w:hint="eastAsia"/>
+        </w:rPr>
       </w:pPr>
       <w:r>
         <w:rPr>
@@ -1667,7 +1672,7 @@
                     <pic:cNvPicPr/>
                   </pic:nvPicPr>
                   <pic:blipFill>
-                    <a:blip r:embed="rId23"/>
+                    <a:blip r:embed="rId21"/>
                     <a:stretch>
                       <a:fillRect/>
                     </a:stretch>
@@ -1794,7 +1799,7 @@
                     <pic:cNvPicPr/>
                   </pic:nvPicPr>
                   <pic:blipFill>
-                    <a:blip r:embed="rId24"/>
+                    <a:blip r:embed="rId22"/>
                     <a:stretch>
                       <a:fillRect/>
                     </a:stretch>
@@ -1871,7 +1876,7 @@
                     <pic:cNvPicPr/>
                   </pic:nvPicPr>
                   <pic:blipFill>
-                    <a:blip r:embed="rId25"/>
+                    <a:blip r:embed="rId23"/>
                     <a:stretch>
                       <a:fillRect/>
                     </a:stretch>
@@ -1934,12 +1939,20 @@
           <w:bCs/>
         </w:rPr>
       </w:pPr>
+      <w:proofErr w:type="spellStart"/>
       <w:r>
         <w:rPr>
           <w:rFonts w:hint="eastAsia"/>
         </w:rPr>
         <w:lastRenderedPageBreak/>
-        <w:t>Deepseek接口地址（Endpoint）</w:t>
+        <w:t>Deepseek</w:t>
+      </w:r>
+      <w:proofErr w:type="spellEnd"/>
+      <w:r>
+        <w:rPr>
+          <w:rFonts w:hint="eastAsia"/>
+        </w:rPr>
+        <w:t>接口地址（Endpoint）</w:t>
       </w:r>
       <w:r>
         <w:rPr>
@@ -2144,7 +2157,7 @@
                     <pic:cNvPicPr/>
                   </pic:nvPicPr>
                   <pic:blipFill>
-                    <a:blip r:embed="rId26"/>
+                    <a:blip r:embed="rId24"/>
                     <a:stretch>
                       <a:fillRect/>
                     </a:stretch>
@@ -2197,9 +2210,27 @@
         <w:t>，单击图标进入网页，右键弹出托盘菜单。</w:t>
       </w:r>
     </w:p>
-    <w:p/>
-    <w:p/>
-    <w:p/>
+    <w:p>
+      <w:pPr>
+        <w:rPr>
+          <w:rFonts w:hint="eastAsia"/>
+        </w:rPr>
+      </w:pPr>
+    </w:p>
+    <w:p>
+      <w:pPr>
+        <w:rPr>
+          <w:rFonts w:hint="eastAsia"/>
+        </w:rPr>
+      </w:pPr>
+    </w:p>
+    <w:p>
+      <w:pPr>
+        <w:rPr>
+          <w:rFonts w:hint="eastAsia"/>
+        </w:rPr>
+      </w:pPr>
+    </w:p>
     <w:p>
       <w:pPr>
         <w:rPr>
@@ -2249,6 +2280,9 @@
           <w:ilvl w:val="0"/>
           <w:numId w:val="5"/>
         </w:numPr>
+        <w:rPr>
+          <w:rFonts w:hint="eastAsia"/>
+        </w:rPr>
       </w:pPr>
       <w:r>
         <w:rPr>
@@ -2264,6 +2298,9 @@
           <w:ilvl w:val="0"/>
           <w:numId w:val="5"/>
         </w:numPr>
+        <w:rPr>
+          <w:rFonts w:hint="eastAsia"/>
+        </w:rPr>
       </w:pPr>
       <w:r>
         <w:rPr>
@@ -2279,6 +2316,9 @@
           <w:ilvl w:val="0"/>
           <w:numId w:val="5"/>
         </w:numPr>
+        <w:rPr>
+          <w:rFonts w:hint="eastAsia"/>
+        </w:rPr>
       </w:pPr>
       <w:r>
         <w:rPr>
@@ -2312,6 +2352,9 @@
           <w:ilvl w:val="0"/>
           <w:numId w:val="5"/>
         </w:numPr>
+        <w:rPr>
+          <w:rFonts w:hint="eastAsia"/>
+        </w:rPr>
       </w:pPr>
       <w:r>
         <w:rPr>
@@ -2361,6 +2404,9 @@
           <w:ilvl w:val="0"/>
           <w:numId w:val="5"/>
         </w:numPr>
+        <w:rPr>
+          <w:rFonts w:hint="eastAsia"/>
+        </w:rPr>
       </w:pPr>
       <w:r>
         <w:rPr>
@@ -2418,6 +2464,9 @@
           <w:ilvl w:val="0"/>
           <w:numId w:val="5"/>
         </w:numPr>
+        <w:rPr>
+          <w:rFonts w:hint="eastAsia"/>
+        </w:rPr>
       </w:pPr>
       <w:r>
         <w:rPr>
@@ -2459,6 +2508,9 @@
           <w:ilvl w:val="0"/>
           <w:numId w:val="5"/>
         </w:numPr>
+        <w:rPr>
+          <w:rFonts w:hint="eastAsia"/>
+        </w:rPr>
       </w:pPr>
       <w:r>
         <w:rPr>
@@ -2500,6 +2552,9 @@
           <w:ilvl w:val="0"/>
           <w:numId w:val="5"/>
         </w:numPr>
+        <w:rPr>
+          <w:rFonts w:hint="eastAsia"/>
+        </w:rPr>
       </w:pPr>
       <w:r>
         <w:rPr>
@@ -2534,29 +2589,108 @@
         <w:t>）</w:t>
       </w:r>
     </w:p>
-    <w:p/>
-    <w:p/>
-    <w:p/>
-    <w:p/>
-    <w:p/>
-    <w:p/>
-    <w:p/>
-    <w:p/>
-    <w:p/>
-    <w:p/>
-    <w:p/>
-    <w:p/>
-    <w:p/>
-    <w:p>
-      <w:pPr>
-        <w:rPr>
-          <w:rFonts w:hint="eastAsia"/>
-        </w:rPr>
-      </w:pPr>
-    </w:p>
-    <w:p>
-      <w:pPr>
-        <w:rPr>
+    <w:p>
+      <w:pPr>
+        <w:rPr>
+          <w:rFonts w:hint="eastAsia"/>
+        </w:rPr>
+      </w:pPr>
+    </w:p>
+    <w:p>
+      <w:pPr>
+        <w:rPr>
+          <w:rFonts w:hint="eastAsia"/>
+        </w:rPr>
+      </w:pPr>
+    </w:p>
+    <w:p>
+      <w:pPr>
+        <w:rPr>
+          <w:rFonts w:hint="eastAsia"/>
+        </w:rPr>
+      </w:pPr>
+    </w:p>
+    <w:p>
+      <w:pPr>
+        <w:rPr>
+          <w:rFonts w:hint="eastAsia"/>
+        </w:rPr>
+      </w:pPr>
+    </w:p>
+    <w:p>
+      <w:pPr>
+        <w:rPr>
+          <w:rFonts w:hint="eastAsia"/>
+        </w:rPr>
+      </w:pPr>
+    </w:p>
+    <w:p>
+      <w:pPr>
+        <w:rPr>
+          <w:rFonts w:hint="eastAsia"/>
+        </w:rPr>
+      </w:pPr>
+    </w:p>
+    <w:p>
+      <w:pPr>
+        <w:rPr>
+          <w:rFonts w:hint="eastAsia"/>
+        </w:rPr>
+      </w:pPr>
+    </w:p>
+    <w:p>
+      <w:pPr>
+        <w:rPr>
+          <w:rFonts w:hint="eastAsia"/>
+        </w:rPr>
+      </w:pPr>
+    </w:p>
+    <w:p>
+      <w:pPr>
+        <w:rPr>
+          <w:rFonts w:hint="eastAsia"/>
+        </w:rPr>
+      </w:pPr>
+    </w:p>
+    <w:p>
+      <w:pPr>
+        <w:rPr>
+          <w:rFonts w:hint="eastAsia"/>
+        </w:rPr>
+      </w:pPr>
+    </w:p>
+    <w:p>
+      <w:pPr>
+        <w:rPr>
+          <w:rFonts w:hint="eastAsia"/>
+        </w:rPr>
+      </w:pPr>
+    </w:p>
+    <w:p>
+      <w:pPr>
+        <w:rPr>
+          <w:rFonts w:hint="eastAsia"/>
+        </w:rPr>
+      </w:pPr>
+    </w:p>
+    <w:p>
+      <w:pPr>
+        <w:rPr>
+          <w:rFonts w:hint="eastAsia"/>
+        </w:rPr>
+      </w:pPr>
+    </w:p>
+    <w:p>
+      <w:pPr>
+        <w:rPr>
+          <w:rFonts w:hint="eastAsia"/>
+        </w:rPr>
+      </w:pPr>
+    </w:p>
+    <w:p>
+      <w:pPr>
+        <w:rPr>
+          <w:rFonts w:hint="eastAsia"/>
           <w:b/>
           <w:bCs/>
           <w:sz w:val="24"/>
@@ -2596,6 +2730,11 @@
       </w:r>
     </w:p>
     <w:p>
+      <w:pPr>
+        <w:rPr>
+          <w:rFonts w:hint="eastAsia"/>
+        </w:rPr>
+      </w:pPr>
       <w:r>
         <w:rPr>
           <w:rFonts w:hint="eastAsia"/>
@@ -2623,6 +2762,9 @@
           <w:ilvl w:val="0"/>
           <w:numId w:val="6"/>
         </w:numPr>
+        <w:rPr>
+          <w:rFonts w:hint="eastAsia"/>
+        </w:rPr>
       </w:pPr>
       <w:r>
         <w:rPr>
@@ -2632,6 +2774,11 @@
       </w:r>
     </w:p>
     <w:p>
+      <w:pPr>
+        <w:rPr>
+          <w:rFonts w:hint="eastAsia"/>
+        </w:rPr>
+      </w:pPr>
       <w:r>
         <w:rPr>
           <w:rFonts w:hint="eastAsia"/>
@@ -2681,6 +2828,9 @@
           <w:ilvl w:val="0"/>
           <w:numId w:val="6"/>
         </w:numPr>
+        <w:rPr>
+          <w:rFonts w:hint="eastAsia"/>
+        </w:rPr>
       </w:pPr>
       <w:r>
         <w:rPr>
@@ -2690,6 +2840,11 @@
       </w:r>
     </w:p>
     <w:p>
+      <w:pPr>
+        <w:rPr>
+          <w:rFonts w:hint="eastAsia"/>
+        </w:rPr>
+      </w:pPr>
       <w:r>
         <w:rPr>
           <w:rFonts w:hint="eastAsia"/>
@@ -2712,6 +2867,11 @@
       </w:r>
     </w:p>
     <w:p>
+      <w:pPr>
+        <w:rPr>
+          <w:rFonts w:hint="eastAsia"/>
+        </w:rPr>
+      </w:pPr>
       <w:r>
         <w:rPr>
           <w:rFonts w:hint="eastAsia"/>
@@ -2741,6 +2901,11 @@
       </w:pPr>
     </w:p>
     <w:p>
+      <w:pPr>
+        <w:rPr>
+          <w:rFonts w:hint="eastAsia"/>
+        </w:rPr>
+      </w:pPr>
       <w:r>
         <w:rPr>
           <w:rFonts w:hint="eastAsia"/>
@@ -2749,6 +2914,11 @@
       </w:r>
     </w:p>
     <w:p>
+      <w:pPr>
+        <w:rPr>
+          <w:rFonts w:hint="eastAsia"/>
+        </w:rPr>
+      </w:pPr>
       <w:r>
         <w:rPr>
           <w:rFonts w:hint="eastAsia"/>
@@ -2785,6 +2955,11 @@
       </w:r>
     </w:p>
     <w:p>
+      <w:pPr>
+        <w:rPr>
+          <w:rFonts w:hint="eastAsia"/>
+        </w:rPr>
+      </w:pPr>
       <w:r>
         <w:rPr>
           <w:rFonts w:hint="eastAsia"/>
@@ -2807,6 +2982,11 @@
       </w:r>
     </w:p>
     <w:p>
+      <w:pPr>
+        <w:rPr>
+          <w:rFonts w:hint="eastAsia"/>
+        </w:rPr>
+      </w:pPr>
       <w:r>
         <w:rPr>
           <w:rFonts w:hint="eastAsia"/>
@@ -2836,6 +3016,11 @@
       </w:pPr>
     </w:p>
     <w:p>
+      <w:pPr>
+        <w:rPr>
+          <w:rFonts w:hint="eastAsia"/>
+        </w:rPr>
+      </w:pPr>
       <w:r>
         <w:rPr>
           <w:rFonts w:hint="eastAsia"/>
@@ -2857,7 +3042,13 @@
         <w:t>。</w:t>
       </w:r>
     </w:p>
-    <w:p/>
+    <w:p>
+      <w:pPr>
+        <w:rPr>
+          <w:rFonts w:hint="eastAsia"/>
+        </w:rPr>
+      </w:pPr>
+    </w:p>
     <w:p>
       <w:pPr>
         <w:pStyle w:val="a9"/>
@@ -2865,6 +3056,9 @@
           <w:ilvl w:val="0"/>
           <w:numId w:val="6"/>
         </w:numPr>
+        <w:rPr>
+          <w:rFonts w:hint="eastAsia"/>
+        </w:rPr>
       </w:pPr>
       <w:r>
         <w:rPr>
@@ -2936,6 +3130,11 @@
       </w:r>
     </w:p>
     <w:p>
+      <w:pPr>
+        <w:rPr>
+          <w:rFonts w:hint="eastAsia"/>
+        </w:rPr>
+      </w:pPr>
       <w:r>
         <w:rPr>
           <w:rFonts w:hint="eastAsia"/>
@@ -2965,6 +3164,11 @@
       </w:pPr>
     </w:p>
     <w:p>
+      <w:pPr>
+        <w:rPr>
+          <w:rFonts w:hint="eastAsia"/>
+        </w:rPr>
+      </w:pPr>
       <w:r>
         <w:rPr>
           <w:rFonts w:hint="eastAsia"/>
@@ -2974,14 +3178,38 @@
       </w:r>
     </w:p>
     <w:p>
-      <w:r>
-        <w:rPr>
-          <w:rFonts w:hint="eastAsia"/>
-        </w:rPr>
-        <w:t>长期记忆为“我叫Blinvo，在天津理工大学上大三，今年19岁”</w:t>
-      </w:r>
-    </w:p>
-    <w:p>
+      <w:pPr>
+        <w:rPr>
+          <w:rFonts w:hint="eastAsia"/>
+        </w:rPr>
+      </w:pPr>
+      <w:r>
+        <w:rPr>
+          <w:rFonts w:hint="eastAsia"/>
+        </w:rPr>
+        <w:t>长期记忆为“我叫</w:t>
+      </w:r>
+      <w:proofErr w:type="spellStart"/>
+      <w:r>
+        <w:rPr>
+          <w:rFonts w:hint="eastAsia"/>
+        </w:rPr>
+        <w:t>Blinvo</w:t>
+      </w:r>
+      <w:proofErr w:type="spellEnd"/>
+      <w:r>
+        <w:rPr>
+          <w:rFonts w:hint="eastAsia"/>
+        </w:rPr>
+        <w:t>，在天津理工大学上大三，今年19岁”</w:t>
+      </w:r>
+    </w:p>
+    <w:p>
+      <w:pPr>
+        <w:rPr>
+          <w:rFonts w:hint="eastAsia"/>
+        </w:rPr>
+      </w:pPr>
       <w:r>
         <w:rPr>
           <w:rFonts w:hint="eastAsia"/>
@@ -2997,6 +3225,11 @@
       </w:pPr>
     </w:p>
     <w:p>
+      <w:pPr>
+        <w:rPr>
+          <w:rFonts w:hint="eastAsia"/>
+        </w:rPr>
+      </w:pPr>
       <w:r>
         <w:rPr>
           <w:rFonts w:hint="eastAsia"/>
@@ -3005,6 +3238,11 @@
       </w:r>
     </w:p>
     <w:p>
+      <w:pPr>
+        <w:rPr>
+          <w:rFonts w:hint="eastAsia"/>
+        </w:rPr>
+      </w:pPr>
       <w:r>
         <w:rPr>
           <w:rFonts w:hint="eastAsia"/>
@@ -3013,6 +3251,11 @@
       </w:r>
     </w:p>
     <w:p>
+      <w:pPr>
+        <w:rPr>
+          <w:rFonts w:hint="eastAsia"/>
+        </w:rPr>
+      </w:pPr>
       <w:r>
         <w:rPr>
           <w:rFonts w:hint="eastAsia"/>
@@ -3033,8 +3276,19 @@
         <w:t>“那周三一起出去怎么样？”</w:t>
       </w:r>
     </w:p>
-    <w:p/>
-    <w:p>
+    <w:p>
+      <w:pPr>
+        <w:rPr>
+          <w:rFonts w:hint="eastAsia"/>
+        </w:rPr>
+      </w:pPr>
+    </w:p>
+    <w:p>
+      <w:pPr>
+        <w:rPr>
+          <w:rFonts w:hint="eastAsia"/>
+        </w:rPr>
+      </w:pPr>
       <w:r>
         <w:rPr>
           <w:rFonts w:hint="eastAsia"/>
@@ -3057,6 +3311,11 @@
       </w:r>
     </w:p>
     <w:p>
+      <w:pPr>
+        <w:rPr>
+          <w:rFonts w:hint="eastAsia"/>
+        </w:rPr>
+      </w:pPr>
       <w:r>
         <w:rPr>
           <w:rFonts w:hint="eastAsia"/>
@@ -3119,6 +3378,9 @@
           <w:ilvl w:val="0"/>
           <w:numId w:val="6"/>
         </w:numPr>
+        <w:rPr>
+          <w:rFonts w:hint="eastAsia"/>
+        </w:rPr>
       </w:pPr>
       <w:r>
         <w:rPr>
@@ -3175,23 +3437,19 @@
         <w:rPr>
           <w:rFonts w:hint="eastAsia"/>
         </w:rPr>
-        <w:t>，</w:t>
-      </w:r>
-      <w:r>
-        <w:rPr>
-          <w:rFonts w:hint="eastAsia"/>
-        </w:rPr>
-        <w:t>看滑块是否起效</w:t>
-      </w:r>
-      <w:r>
-        <w:rPr>
-          <w:rFonts w:hint="eastAsia"/>
-        </w:rPr>
-        <w:t>：</w:t>
-      </w:r>
-    </w:p>
-    <w:p>
-      <w:r>
+        <w:t>，看滑块是否起效：</w:t>
+      </w:r>
+    </w:p>
+    <w:p>
+      <w:pPr>
+        <w:rPr>
+          <w:rFonts w:hint="eastAsia"/>
+        </w:rPr>
+      </w:pPr>
+      <w:r>
+        <w:rPr>
+          <w:noProof/>
+        </w:rPr>
         <w:drawing>
           <wp:inline distT="0" distB="0" distL="0" distR="0" wp14:anchorId="42F1C4D7" wp14:editId="0879DFF2">
             <wp:extent cx="5274310" cy="2985770"/>
@@ -3208,7 +3466,7 @@
                     <pic:cNvPicPr/>
                   </pic:nvPicPr>
                   <pic:blipFill>
-                    <a:blip r:embed="rId27"/>
+                    <a:blip r:embed="rId25"/>
                     <a:stretch>
                       <a:fillRect/>
                     </a:stretch>
@@ -3263,6 +3521,11 @@
       </w:r>
     </w:p>
     <w:p>
+      <w:pPr>
+        <w:rPr>
+          <w:rFonts w:hint="eastAsia"/>
+        </w:rPr>
+      </w:pPr>
       <w:r>
         <w:rPr>
           <w:rFonts w:hint="eastAsia"/>
@@ -3270,7 +3533,13 @@
         <w:t>允许模式下，信使不发送卡片，文件直接发送成功。</w:t>
       </w:r>
     </w:p>
-    <w:p/>
+    <w:p>
+      <w:pPr>
+        <w:rPr>
+          <w:rFonts w:hint="eastAsia"/>
+        </w:rPr>
+      </w:pPr>
+    </w:p>
     <w:p>
       <w:pPr>
         <w:pStyle w:val="a9"/>
@@ -3278,6 +3547,9 @@
           <w:ilvl w:val="0"/>
           <w:numId w:val="6"/>
         </w:numPr>
+        <w:rPr>
+          <w:rFonts w:hint="eastAsia"/>
+        </w:rPr>
       </w:pPr>
       <w:r>
         <w:rPr>
@@ -3287,6 +3559,11 @@
       </w:r>
     </w:p>
     <w:p>
+      <w:pPr>
+        <w:rPr>
+          <w:rFonts w:hint="eastAsia"/>
+        </w:rPr>
+      </w:pPr>
       <w:r>
         <w:rPr>
           <w:rFonts w:hint="eastAsia"/>
@@ -3335,6 +3612,11 @@
       </w:r>
     </w:p>
     <w:p>
+      <w:pPr>
+        <w:rPr>
+          <w:rFonts w:hint="eastAsia"/>
+        </w:rPr>
+      </w:pPr>
       <w:r>
         <w:rPr>
           <w:rFonts w:hint="eastAsia"/>

</xml_diff>